<commit_message>
Update QA checklists and peer review documents
Revised multiple quality assurance checklists and peer review documents for Fedora, Kali, and Ubuntu configurations.

Also updated the evaluation methodology for Ubuntu Server to reflect recent changes in testing and review procedures.
</commit_message>
<xml_diff>
--- a/04-Development-and-Quality-Assurance/Evaluation-Testing/Methodology - Ubuntu Server.docx
+++ b/04-Development-and-Quality-Assurance/Evaluation-Testing/Methodology - Ubuntu Server.docx
@@ -35,9 +35,6 @@
           <w:szCs w:val="24"/>
         </w:rPr>
       </w:pPr>
-      <w:r>
-        <w:t>TBD</w:t>
-      </w:r>
     </w:p>
     <w:p>
       <w:pPr>
@@ -61,49 +58,113 @@
         <w:spacing w:after="0"/>
       </w:pPr>
       <w:r>
-        <w:t>Disable cloud-init:</w:t>
-      </w:r>
-    </w:p>
-    <w:p>
-      <w:pPr>
-        <w:rPr>
-          <w:rFonts w:ascii="Fira Code Retina" w:hAnsi="Fira Code Retina" w:cs="Fira Code Retina"/>
-          <w:sz w:val="20"/>
-          <w:szCs w:val="20"/>
-        </w:rPr>
-      </w:pPr>
-      <w:r>
-        <w:rPr>
-          <w:rFonts w:ascii="Fira Code Retina" w:hAnsi="Fira Code Retina" w:cs="Fira Code Retina"/>
-          <w:sz w:val="20"/>
-          <w:szCs w:val="20"/>
-        </w:rPr>
-        <w:t>sudo touch /etc/cloud/cloud-init.disabled</w:t>
-      </w:r>
-    </w:p>
-    <w:p>
-      <w:pPr>
-        <w:spacing w:after="0"/>
-      </w:pPr>
-      <w:r>
-        <w:t>Disable motd:</w:t>
-      </w:r>
-    </w:p>
-    <w:p>
-      <w:pPr>
-        <w:rPr>
-          <w:rFonts w:ascii="Fira Code Retina" w:hAnsi="Fira Code Retina" w:cs="Fira Code Retina"/>
-          <w:sz w:val="20"/>
-          <w:szCs w:val="20"/>
-        </w:rPr>
-      </w:pPr>
-      <w:r>
-        <w:rPr>
-          <w:rFonts w:ascii="Fira Code Retina" w:hAnsi="Fira Code Retina" w:cs="Fira Code Retina"/>
-          <w:sz w:val="20"/>
-          <w:szCs w:val="20"/>
-        </w:rPr>
-        <w:t>sudo nano /etc/default/motd-news</w:t>
+        <w:t>Disable cloud-</w:t>
+      </w:r>
+      <w:proofErr w:type="spellStart"/>
+      <w:r>
+        <w:t>init</w:t>
+      </w:r>
+      <w:proofErr w:type="spellEnd"/>
+      <w:r>
+        <w:t>:</w:t>
+      </w:r>
+    </w:p>
+    <w:p>
+      <w:pPr>
+        <w:rPr>
+          <w:rFonts w:ascii="Fira Code Retina" w:hAnsi="Fira Code Retina" w:cs="Fira Code Retina"/>
+          <w:sz w:val="20"/>
+          <w:szCs w:val="20"/>
+        </w:rPr>
+      </w:pPr>
+      <w:proofErr w:type="spellStart"/>
+      <w:r>
+        <w:rPr>
+          <w:rFonts w:ascii="Fira Code Retina" w:hAnsi="Fira Code Retina" w:cs="Fira Code Retina"/>
+          <w:sz w:val="20"/>
+          <w:szCs w:val="20"/>
+        </w:rPr>
+        <w:t>sudo</w:t>
+      </w:r>
+      <w:proofErr w:type="spellEnd"/>
+      <w:r>
+        <w:rPr>
+          <w:rFonts w:ascii="Fira Code Retina" w:hAnsi="Fira Code Retina" w:cs="Fira Code Retina"/>
+          <w:sz w:val="20"/>
+          <w:szCs w:val="20"/>
+        </w:rPr>
+        <w:t xml:space="preserve"> touch /etc/cloud/cloud-</w:t>
+      </w:r>
+      <w:proofErr w:type="spellStart"/>
+      <w:r>
+        <w:rPr>
+          <w:rFonts w:ascii="Fira Code Retina" w:hAnsi="Fira Code Retina" w:cs="Fira Code Retina"/>
+          <w:sz w:val="20"/>
+          <w:szCs w:val="20"/>
+        </w:rPr>
+        <w:t>init.disabled</w:t>
+      </w:r>
+      <w:proofErr w:type="spellEnd"/>
+    </w:p>
+    <w:p>
+      <w:pPr>
+        <w:spacing w:after="0"/>
+      </w:pPr>
+      <w:r>
+        <w:t xml:space="preserve">Disable </w:t>
+      </w:r>
+      <w:proofErr w:type="spellStart"/>
+      <w:r>
+        <w:t>motd</w:t>
+      </w:r>
+      <w:proofErr w:type="spellEnd"/>
+      <w:r>
+        <w:t>:</w:t>
+      </w:r>
+    </w:p>
+    <w:p>
+      <w:pPr>
+        <w:rPr>
+          <w:rFonts w:ascii="Fira Code Retina" w:hAnsi="Fira Code Retina" w:cs="Fira Code Retina"/>
+          <w:sz w:val="20"/>
+          <w:szCs w:val="20"/>
+        </w:rPr>
+      </w:pPr>
+      <w:proofErr w:type="spellStart"/>
+      <w:r>
+        <w:rPr>
+          <w:rFonts w:ascii="Fira Code Retina" w:hAnsi="Fira Code Retina" w:cs="Fira Code Retina"/>
+          <w:sz w:val="20"/>
+          <w:szCs w:val="20"/>
+        </w:rPr>
+        <w:t>sudo</w:t>
+      </w:r>
+      <w:proofErr w:type="spellEnd"/>
+      <w:r>
+        <w:rPr>
+          <w:rFonts w:ascii="Fira Code Retina" w:hAnsi="Fira Code Retina" w:cs="Fira Code Retina"/>
+          <w:sz w:val="20"/>
+          <w:szCs w:val="20"/>
+        </w:rPr>
+        <w:t xml:space="preserve"> nano /etc/default/</w:t>
+      </w:r>
+      <w:proofErr w:type="spellStart"/>
+      <w:r>
+        <w:rPr>
+          <w:rFonts w:ascii="Fira Code Retina" w:hAnsi="Fira Code Retina" w:cs="Fira Code Retina"/>
+          <w:sz w:val="20"/>
+          <w:szCs w:val="20"/>
+        </w:rPr>
+        <w:t>motd</w:t>
+      </w:r>
+      <w:proofErr w:type="spellEnd"/>
+      <w:r>
+        <w:rPr>
+          <w:rFonts w:ascii="Fira Code Retina" w:hAnsi="Fira Code Retina" w:cs="Fira Code Retina"/>
+          <w:sz w:val="20"/>
+          <w:szCs w:val="20"/>
+        </w:rPr>
+        <w:t>-news</w:t>
       </w:r>
     </w:p>
     <w:p>
@@ -160,13 +221,59 @@
           <w:szCs w:val="20"/>
         </w:rPr>
       </w:pPr>
-      <w:r>
-        <w:rPr>
-          <w:rFonts w:ascii="Fira Code Retina" w:hAnsi="Fira Code Retina" w:cs="Fira Code Retina"/>
-          <w:sz w:val="20"/>
-          <w:szCs w:val="20"/>
-        </w:rPr>
-        <w:t>sudo chmod -x /etc/update-motd.d/*</w:t>
+      <w:proofErr w:type="spellStart"/>
+      <w:r>
+        <w:rPr>
+          <w:rFonts w:ascii="Fira Code Retina" w:hAnsi="Fira Code Retina" w:cs="Fira Code Retina"/>
+          <w:sz w:val="20"/>
+          <w:szCs w:val="20"/>
+        </w:rPr>
+        <w:t>sudo</w:t>
+      </w:r>
+      <w:proofErr w:type="spellEnd"/>
+      <w:r>
+        <w:rPr>
+          <w:rFonts w:ascii="Fira Code Retina" w:hAnsi="Fira Code Retina" w:cs="Fira Code Retina"/>
+          <w:sz w:val="20"/>
+          <w:szCs w:val="20"/>
+        </w:rPr>
+        <w:t xml:space="preserve"> </w:t>
+      </w:r>
+      <w:proofErr w:type="spellStart"/>
+      <w:r>
+        <w:rPr>
+          <w:rFonts w:ascii="Fira Code Retina" w:hAnsi="Fira Code Retina" w:cs="Fira Code Retina"/>
+          <w:sz w:val="20"/>
+          <w:szCs w:val="20"/>
+        </w:rPr>
+        <w:t>chmod</w:t>
+      </w:r>
+      <w:proofErr w:type="spellEnd"/>
+      <w:r>
+        <w:rPr>
+          <w:rFonts w:ascii="Fira Code Retina" w:hAnsi="Fira Code Retina" w:cs="Fira Code Retina"/>
+          <w:sz w:val="20"/>
+          <w:szCs w:val="20"/>
+        </w:rPr>
+        <w:t xml:space="preserve"> -x /etc/update-</w:t>
+      </w:r>
+      <w:proofErr w:type="spellStart"/>
+      <w:r>
+        <w:rPr>
+          <w:rFonts w:ascii="Fira Code Retina" w:hAnsi="Fira Code Retina" w:cs="Fira Code Retina"/>
+          <w:sz w:val="20"/>
+          <w:szCs w:val="20"/>
+        </w:rPr>
+        <w:t>motd.d</w:t>
+      </w:r>
+      <w:proofErr w:type="spellEnd"/>
+      <w:r>
+        <w:rPr>
+          <w:rFonts w:ascii="Fira Code Retina" w:hAnsi="Fira Code Retina" w:cs="Fira Code Retina"/>
+          <w:sz w:val="20"/>
+          <w:szCs w:val="20"/>
+        </w:rPr>
+        <w:t>/*</w:t>
       </w:r>
     </w:p>
     <w:p>
@@ -180,32 +287,92 @@
         <w:rPr>
           <w:rFonts w:cs="Fira Code Retina"/>
         </w:rPr>
-        <w:t>Force motd to update:</w:t>
-      </w:r>
-    </w:p>
-    <w:p>
-      <w:pPr>
-        <w:rPr>
-          <w:rFonts w:ascii="Fira Code Retina" w:hAnsi="Fira Code Retina" w:cs="Fira Code Retina"/>
-          <w:sz w:val="20"/>
-          <w:szCs w:val="20"/>
-        </w:rPr>
-      </w:pPr>
-      <w:r>
-        <w:rPr>
-          <w:rFonts w:ascii="Fira Code Retina" w:hAnsi="Fira Code Retina" w:cs="Fira Code Retina"/>
-          <w:sz w:val="20"/>
-          <w:szCs w:val="20"/>
-        </w:rPr>
-        <w:t xml:space="preserve">sudo </w:t>
-      </w:r>
-      <w:r>
-        <w:rPr>
-          <w:rFonts w:ascii="Fira Code Retina" w:hAnsi="Fira Code Retina" w:cs="Fira Code Retina"/>
-          <w:sz w:val="20"/>
-          <w:szCs w:val="20"/>
-        </w:rPr>
-        <w:t>/usr/lib/update-notifier/update-motd-updates-available --force</w:t>
+        <w:t xml:space="preserve">Force </w:t>
+      </w:r>
+      <w:proofErr w:type="spellStart"/>
+      <w:r>
+        <w:rPr>
+          <w:rFonts w:cs="Fira Code Retina"/>
+        </w:rPr>
+        <w:t>motd</w:t>
+      </w:r>
+      <w:proofErr w:type="spellEnd"/>
+      <w:r>
+        <w:rPr>
+          <w:rFonts w:cs="Fira Code Retina"/>
+        </w:rPr>
+        <w:t xml:space="preserve"> to update:</w:t>
+      </w:r>
+    </w:p>
+    <w:p>
+      <w:pPr>
+        <w:rPr>
+          <w:rFonts w:ascii="Fira Code Retina" w:hAnsi="Fira Code Retina" w:cs="Fira Code Retina"/>
+          <w:sz w:val="20"/>
+          <w:szCs w:val="20"/>
+        </w:rPr>
+      </w:pPr>
+      <w:proofErr w:type="spellStart"/>
+      <w:r>
+        <w:rPr>
+          <w:rFonts w:ascii="Fira Code Retina" w:hAnsi="Fira Code Retina" w:cs="Fira Code Retina"/>
+          <w:sz w:val="20"/>
+          <w:szCs w:val="20"/>
+        </w:rPr>
+        <w:t>sudo</w:t>
+      </w:r>
+      <w:proofErr w:type="spellEnd"/>
+      <w:r>
+        <w:rPr>
+          <w:rFonts w:ascii="Fira Code Retina" w:hAnsi="Fira Code Retina" w:cs="Fira Code Retina"/>
+          <w:sz w:val="20"/>
+          <w:szCs w:val="20"/>
+        </w:rPr>
+        <w:t xml:space="preserve"> </w:t>
+      </w:r>
+      <w:r>
+        <w:rPr>
+          <w:rFonts w:ascii="Fira Code Retina" w:hAnsi="Fira Code Retina" w:cs="Fira Code Retina"/>
+          <w:sz w:val="20"/>
+          <w:szCs w:val="20"/>
+        </w:rPr>
+        <w:t>/</w:t>
+      </w:r>
+      <w:proofErr w:type="spellStart"/>
+      <w:r>
+        <w:rPr>
+          <w:rFonts w:ascii="Fira Code Retina" w:hAnsi="Fira Code Retina" w:cs="Fira Code Retina"/>
+          <w:sz w:val="20"/>
+          <w:szCs w:val="20"/>
+        </w:rPr>
+        <w:t>usr</w:t>
+      </w:r>
+      <w:proofErr w:type="spellEnd"/>
+      <w:r>
+        <w:rPr>
+          <w:rFonts w:ascii="Fira Code Retina" w:hAnsi="Fira Code Retina" w:cs="Fira Code Retina"/>
+          <w:sz w:val="20"/>
+          <w:szCs w:val="20"/>
+        </w:rPr>
+        <w:t>/lib/update-notifier/update-</w:t>
+      </w:r>
+      <w:proofErr w:type="spellStart"/>
+      <w:r>
+        <w:rPr>
+          <w:rFonts w:ascii="Fira Code Retina" w:hAnsi="Fira Code Retina" w:cs="Fira Code Retina"/>
+          <w:sz w:val="20"/>
+          <w:szCs w:val="20"/>
+        </w:rPr>
+        <w:t>motd</w:t>
+      </w:r>
+      <w:proofErr w:type="spellEnd"/>
+      <w:r>
+        <w:rPr>
+          <w:rFonts w:ascii="Fira Code Retina" w:hAnsi="Fira Code Retina" w:cs="Fira Code Retina"/>
+          <w:sz w:val="20"/>
+          <w:szCs w:val="20"/>
+        </w:rPr>
+        <w:t>-updates-available --force</w:t>
       </w:r>
     </w:p>
     <w:p>
@@ -224,13 +391,113 @@
           <w:szCs w:val="20"/>
         </w:rPr>
       </w:pPr>
-      <w:r>
-        <w:rPr>
-          <w:rFonts w:ascii="Fira Code Retina" w:hAnsi="Fira Code Retina" w:cs="Fira Code Retina"/>
-          <w:sz w:val="20"/>
-          <w:szCs w:val="20"/>
-        </w:rPr>
-        <w:t>sudo mkdir -p /etc/systemd/system/systemd-networkd-wait-online.service.d/</w:t>
+      <w:proofErr w:type="spellStart"/>
+      <w:r>
+        <w:rPr>
+          <w:rFonts w:ascii="Fira Code Retina" w:hAnsi="Fira Code Retina" w:cs="Fira Code Retina"/>
+          <w:sz w:val="20"/>
+          <w:szCs w:val="20"/>
+        </w:rPr>
+        <w:t>sudo</w:t>
+      </w:r>
+      <w:proofErr w:type="spellEnd"/>
+      <w:r>
+        <w:rPr>
+          <w:rFonts w:ascii="Fira Code Retina" w:hAnsi="Fira Code Retina" w:cs="Fira Code Retina"/>
+          <w:sz w:val="20"/>
+          <w:szCs w:val="20"/>
+        </w:rPr>
+        <w:t xml:space="preserve"> </w:t>
+      </w:r>
+      <w:proofErr w:type="spellStart"/>
+      <w:r>
+        <w:rPr>
+          <w:rFonts w:ascii="Fira Code Retina" w:hAnsi="Fira Code Retina" w:cs="Fira Code Retina"/>
+          <w:sz w:val="20"/>
+          <w:szCs w:val="20"/>
+        </w:rPr>
+        <w:t>mkdir</w:t>
+      </w:r>
+      <w:proofErr w:type="spellEnd"/>
+      <w:r>
+        <w:rPr>
+          <w:rFonts w:ascii="Fira Code Retina" w:hAnsi="Fira Code Retina" w:cs="Fira Code Retina"/>
+          <w:sz w:val="20"/>
+          <w:szCs w:val="20"/>
+        </w:rPr>
+        <w:t xml:space="preserve"> -p /etc/</w:t>
+      </w:r>
+      <w:proofErr w:type="spellStart"/>
+      <w:r>
+        <w:rPr>
+          <w:rFonts w:ascii="Fira Code Retina" w:hAnsi="Fira Code Retina" w:cs="Fira Code Retina"/>
+          <w:sz w:val="20"/>
+          <w:szCs w:val="20"/>
+        </w:rPr>
+        <w:t>systemd</w:t>
+      </w:r>
+      <w:proofErr w:type="spellEnd"/>
+      <w:r>
+        <w:rPr>
+          <w:rFonts w:ascii="Fira Code Retina" w:hAnsi="Fira Code Retina" w:cs="Fira Code Retina"/>
+          <w:sz w:val="20"/>
+          <w:szCs w:val="20"/>
+        </w:rPr>
+        <w:t>/system/</w:t>
+      </w:r>
+      <w:proofErr w:type="spellStart"/>
+      <w:r>
+        <w:rPr>
+          <w:rFonts w:ascii="Fira Code Retina" w:hAnsi="Fira Code Retina" w:cs="Fira Code Retina"/>
+          <w:sz w:val="20"/>
+          <w:szCs w:val="20"/>
+        </w:rPr>
+        <w:t>systemd</w:t>
+      </w:r>
+      <w:proofErr w:type="spellEnd"/>
+      <w:r>
+        <w:rPr>
+          <w:rFonts w:ascii="Fira Code Retina" w:hAnsi="Fira Code Retina" w:cs="Fira Code Retina"/>
+          <w:sz w:val="20"/>
+          <w:szCs w:val="20"/>
+        </w:rPr>
+        <w:t>-</w:t>
+      </w:r>
+      <w:proofErr w:type="spellStart"/>
+      <w:r>
+        <w:rPr>
+          <w:rFonts w:ascii="Fira Code Retina" w:hAnsi="Fira Code Retina" w:cs="Fira Code Retina"/>
+          <w:sz w:val="20"/>
+          <w:szCs w:val="20"/>
+        </w:rPr>
+        <w:t>networkd</w:t>
+      </w:r>
+      <w:proofErr w:type="spellEnd"/>
+      <w:r>
+        <w:rPr>
+          <w:rFonts w:ascii="Fira Code Retina" w:hAnsi="Fira Code Retina" w:cs="Fira Code Retina"/>
+          <w:sz w:val="20"/>
+          <w:szCs w:val="20"/>
+        </w:rPr>
+        <w:t>-wait-</w:t>
+      </w:r>
+      <w:proofErr w:type="spellStart"/>
+      <w:r>
+        <w:rPr>
+          <w:rFonts w:ascii="Fira Code Retina" w:hAnsi="Fira Code Retina" w:cs="Fira Code Retina"/>
+          <w:sz w:val="20"/>
+          <w:szCs w:val="20"/>
+        </w:rPr>
+        <w:t>online.service.d</w:t>
+      </w:r>
+      <w:proofErr w:type="spellEnd"/>
+      <w:r>
+        <w:rPr>
+          <w:rFonts w:ascii="Fira Code Retina" w:hAnsi="Fira Code Retina" w:cs="Fira Code Retina"/>
+          <w:sz w:val="20"/>
+          <w:szCs w:val="20"/>
+        </w:rPr>
+        <w:t>/</w:t>
       </w:r>
     </w:p>
     <w:p>
@@ -247,13 +514,23 @@
       <w:r>
         <w:br/>
       </w:r>
-      <w:r>
-        <w:rPr>
-          <w:rFonts w:ascii="Fira Code Retina" w:hAnsi="Fira Code Retina" w:cs="Fira Code Retina"/>
-          <w:sz w:val="20"/>
-          <w:szCs w:val="20"/>
-        </w:rPr>
-        <w:t>sudo nano /etc/systemd/system/systemd-networkd-wait-online.service.d/override.conf</w:t>
+      <w:proofErr w:type="spellStart"/>
+      <w:r>
+        <w:rPr>
+          <w:rFonts w:ascii="Fira Code Retina" w:hAnsi="Fira Code Retina" w:cs="Fira Code Retina"/>
+          <w:sz w:val="20"/>
+          <w:szCs w:val="20"/>
+        </w:rPr>
+        <w:t>sudo</w:t>
+      </w:r>
+      <w:proofErr w:type="spellEnd"/>
+      <w:r>
+        <w:rPr>
+          <w:rFonts w:ascii="Fira Code Retina" w:hAnsi="Fira Code Retina" w:cs="Fira Code Retina"/>
+          <w:sz w:val="20"/>
+          <w:szCs w:val="20"/>
+        </w:rPr>
+        <w:t xml:space="preserve"> nano /etc/systemd/system/systemd-networkd-wait-online.service.d/override.conf</w:t>
       </w:r>
     </w:p>
     <w:p>
@@ -291,31 +568,105 @@
           <w:szCs w:val="20"/>
         </w:rPr>
       </w:pPr>
-      <w:r>
-        <w:rPr>
-          <w:rFonts w:ascii="Fira Code Retina" w:hAnsi="Fira Code Retina" w:cs="Fira Code Retina"/>
-          <w:sz w:val="20"/>
-          <w:szCs w:val="20"/>
-        </w:rPr>
-        <w:t>ExecStart=</w:t>
-      </w:r>
-    </w:p>
-    <w:p>
-      <w:pPr>
-        <w:spacing w:after="0"/>
-        <w:rPr>
-          <w:rFonts w:ascii="Fira Code Retina" w:hAnsi="Fira Code Retina" w:cs="Fira Code Retina"/>
-          <w:sz w:val="20"/>
-          <w:szCs w:val="20"/>
-        </w:rPr>
-      </w:pPr>
-      <w:r>
-        <w:rPr>
-          <w:rFonts w:ascii="Fira Code Retina" w:hAnsi="Fira Code Retina" w:cs="Fira Code Retina"/>
-          <w:sz w:val="20"/>
-          <w:szCs w:val="20"/>
-        </w:rPr>
-        <w:t>ExecStart=/lib/systemd/systemd-networkd-wait-online --any</w:t>
+      <w:proofErr w:type="spellStart"/>
+      <w:r>
+        <w:rPr>
+          <w:rFonts w:ascii="Fira Code Retina" w:hAnsi="Fira Code Retina" w:cs="Fira Code Retina"/>
+          <w:sz w:val="20"/>
+          <w:szCs w:val="20"/>
+        </w:rPr>
+        <w:t>ExecStart</w:t>
+      </w:r>
+      <w:proofErr w:type="spellEnd"/>
+      <w:r>
+        <w:rPr>
+          <w:rFonts w:ascii="Fira Code Retina" w:hAnsi="Fira Code Retina" w:cs="Fira Code Retina"/>
+          <w:sz w:val="20"/>
+          <w:szCs w:val="20"/>
+        </w:rPr>
+        <w:t>=</w:t>
+      </w:r>
+    </w:p>
+    <w:p>
+      <w:pPr>
+        <w:spacing w:after="0"/>
+        <w:rPr>
+          <w:rFonts w:ascii="Fira Code Retina" w:hAnsi="Fira Code Retina" w:cs="Fira Code Retina"/>
+          <w:sz w:val="20"/>
+          <w:szCs w:val="20"/>
+        </w:rPr>
+      </w:pPr>
+      <w:proofErr w:type="spellStart"/>
+      <w:r>
+        <w:rPr>
+          <w:rFonts w:ascii="Fira Code Retina" w:hAnsi="Fira Code Retina" w:cs="Fira Code Retina"/>
+          <w:sz w:val="20"/>
+          <w:szCs w:val="20"/>
+        </w:rPr>
+        <w:t>ExecStart</w:t>
+      </w:r>
+      <w:proofErr w:type="spellEnd"/>
+      <w:r>
+        <w:rPr>
+          <w:rFonts w:ascii="Fira Code Retina" w:hAnsi="Fira Code Retina" w:cs="Fira Code Retina"/>
+          <w:sz w:val="20"/>
+          <w:szCs w:val="20"/>
+        </w:rPr>
+        <w:t>=/lib/</w:t>
+      </w:r>
+      <w:proofErr w:type="spellStart"/>
+      <w:r>
+        <w:rPr>
+          <w:rFonts w:ascii="Fira Code Retina" w:hAnsi="Fira Code Retina" w:cs="Fira Code Retina"/>
+          <w:sz w:val="20"/>
+          <w:szCs w:val="20"/>
+        </w:rPr>
+        <w:t>systemd</w:t>
+      </w:r>
+      <w:proofErr w:type="spellEnd"/>
+      <w:r>
+        <w:rPr>
+          <w:rFonts w:ascii="Fira Code Retina" w:hAnsi="Fira Code Retina" w:cs="Fira Code Retina"/>
+          <w:sz w:val="20"/>
+          <w:szCs w:val="20"/>
+        </w:rPr>
+        <w:t>/</w:t>
+      </w:r>
+      <w:proofErr w:type="spellStart"/>
+      <w:r>
+        <w:rPr>
+          <w:rFonts w:ascii="Fira Code Retina" w:hAnsi="Fira Code Retina" w:cs="Fira Code Retina"/>
+          <w:sz w:val="20"/>
+          <w:szCs w:val="20"/>
+        </w:rPr>
+        <w:t>systemd</w:t>
+      </w:r>
+      <w:proofErr w:type="spellEnd"/>
+      <w:r>
+        <w:rPr>
+          <w:rFonts w:ascii="Fira Code Retina" w:hAnsi="Fira Code Retina" w:cs="Fira Code Retina"/>
+          <w:sz w:val="20"/>
+          <w:szCs w:val="20"/>
+        </w:rPr>
+        <w:t>-</w:t>
+      </w:r>
+      <w:proofErr w:type="spellStart"/>
+      <w:r>
+        <w:rPr>
+          <w:rFonts w:ascii="Fira Code Retina" w:hAnsi="Fira Code Retina" w:cs="Fira Code Retina"/>
+          <w:sz w:val="20"/>
+          <w:szCs w:val="20"/>
+        </w:rPr>
+        <w:t>networkd</w:t>
+      </w:r>
+      <w:proofErr w:type="spellEnd"/>
+      <w:r>
+        <w:rPr>
+          <w:rFonts w:ascii="Fira Code Retina" w:hAnsi="Fira Code Retina" w:cs="Fira Code Retina"/>
+          <w:sz w:val="20"/>
+          <w:szCs w:val="20"/>
+        </w:rPr>
+        <w:t>-wait-online --any</w:t>
       </w:r>
     </w:p>
     <w:p>
@@ -352,13 +703,41 @@
           <w:szCs w:val="20"/>
         </w:rPr>
       </w:pPr>
-      <w:r>
-        <w:rPr>
-          <w:rFonts w:ascii="Fira Code Retina" w:hAnsi="Fira Code Retina" w:cs="Fira Code Retina"/>
-          <w:sz w:val="20"/>
-          <w:szCs w:val="20"/>
-        </w:rPr>
-        <w:t>sudo systemctl daemon-reload</w:t>
+      <w:proofErr w:type="spellStart"/>
+      <w:r>
+        <w:rPr>
+          <w:rFonts w:ascii="Fira Code Retina" w:hAnsi="Fira Code Retina" w:cs="Fira Code Retina"/>
+          <w:sz w:val="20"/>
+          <w:szCs w:val="20"/>
+        </w:rPr>
+        <w:t>sudo</w:t>
+      </w:r>
+      <w:proofErr w:type="spellEnd"/>
+      <w:r>
+        <w:rPr>
+          <w:rFonts w:ascii="Fira Code Retina" w:hAnsi="Fira Code Retina" w:cs="Fira Code Retina"/>
+          <w:sz w:val="20"/>
+          <w:szCs w:val="20"/>
+        </w:rPr>
+        <w:t xml:space="preserve"> </w:t>
+      </w:r>
+      <w:proofErr w:type="spellStart"/>
+      <w:r>
+        <w:rPr>
+          <w:rFonts w:ascii="Fira Code Retina" w:hAnsi="Fira Code Retina" w:cs="Fira Code Retina"/>
+          <w:sz w:val="20"/>
+          <w:szCs w:val="20"/>
+        </w:rPr>
+        <w:t>systemctl</w:t>
+      </w:r>
+      <w:proofErr w:type="spellEnd"/>
+      <w:r>
+        <w:rPr>
+          <w:rFonts w:ascii="Fira Code Retina" w:hAnsi="Fira Code Retina" w:cs="Fira Code Retina"/>
+          <w:sz w:val="20"/>
+          <w:szCs w:val="20"/>
+        </w:rPr>
+        <w:t xml:space="preserve"> daemon-reload</w:t>
       </w:r>
     </w:p>
     <w:p>
@@ -391,30 +770,122 @@
           <w:szCs w:val="20"/>
         </w:rPr>
       </w:pPr>
-      <w:r>
-        <w:rPr>
-          <w:rFonts w:ascii="Fira Code Retina" w:hAnsi="Fira Code Retina" w:cs="Fira Code Retina"/>
-          <w:sz w:val="20"/>
-          <w:szCs w:val="20"/>
-        </w:rPr>
-        <w:t>sudo bash -c "echo blacklist nouveau &gt; /etc/modprobe.d/blacklist-nvidia-nouveau.conf"</w:t>
-      </w:r>
-    </w:p>
-    <w:p>
-      <w:pPr>
-        <w:rPr>
-          <w:rFonts w:ascii="Fira Code Retina" w:hAnsi="Fira Code Retina" w:cs="Fira Code Retina"/>
-          <w:sz w:val="20"/>
-          <w:szCs w:val="20"/>
-        </w:rPr>
-      </w:pPr>
-      <w:r>
-        <w:rPr>
-          <w:rFonts w:ascii="Fira Code Retina" w:hAnsi="Fira Code Retina" w:cs="Fira Code Retina"/>
-          <w:sz w:val="20"/>
-          <w:szCs w:val="20"/>
-        </w:rPr>
-        <w:t>sudo bash -c "echo options nouveau modeset=0 &gt;&gt;</w:t>
+      <w:proofErr w:type="spellStart"/>
+      <w:r>
+        <w:rPr>
+          <w:rFonts w:ascii="Fira Code Retina" w:hAnsi="Fira Code Retina" w:cs="Fira Code Retina"/>
+          <w:sz w:val="20"/>
+          <w:szCs w:val="20"/>
+        </w:rPr>
+        <w:t>sudo</w:t>
+      </w:r>
+      <w:proofErr w:type="spellEnd"/>
+      <w:r>
+        <w:rPr>
+          <w:rFonts w:ascii="Fira Code Retina" w:hAnsi="Fira Code Retina" w:cs="Fira Code Retina"/>
+          <w:sz w:val="20"/>
+          <w:szCs w:val="20"/>
+        </w:rPr>
+        <w:t xml:space="preserve"> bash -c "echo blacklist nouveau &gt; /etc/</w:t>
+      </w:r>
+      <w:proofErr w:type="spellStart"/>
+      <w:r>
+        <w:rPr>
+          <w:rFonts w:ascii="Fira Code Retina" w:hAnsi="Fira Code Retina" w:cs="Fira Code Retina"/>
+          <w:sz w:val="20"/>
+          <w:szCs w:val="20"/>
+        </w:rPr>
+        <w:t>modprobe.d</w:t>
+      </w:r>
+      <w:proofErr w:type="spellEnd"/>
+      <w:r>
+        <w:rPr>
+          <w:rFonts w:ascii="Fira Code Retina" w:hAnsi="Fira Code Retina" w:cs="Fira Code Retina"/>
+          <w:sz w:val="20"/>
+          <w:szCs w:val="20"/>
+        </w:rPr>
+        <w:t>/blacklist-</w:t>
+      </w:r>
+      <w:proofErr w:type="spellStart"/>
+      <w:r>
+        <w:rPr>
+          <w:rFonts w:ascii="Fira Code Retina" w:hAnsi="Fira Code Retina" w:cs="Fira Code Retina"/>
+          <w:sz w:val="20"/>
+          <w:szCs w:val="20"/>
+        </w:rPr>
+        <w:t>nvidia</w:t>
+      </w:r>
+      <w:proofErr w:type="spellEnd"/>
+      <w:r>
+        <w:rPr>
+          <w:rFonts w:ascii="Fira Code Retina" w:hAnsi="Fira Code Retina" w:cs="Fira Code Retina"/>
+          <w:sz w:val="20"/>
+          <w:szCs w:val="20"/>
+        </w:rPr>
+        <w:t>-</w:t>
+      </w:r>
+      <w:proofErr w:type="spellStart"/>
+      <w:r>
+        <w:rPr>
+          <w:rFonts w:ascii="Fira Code Retina" w:hAnsi="Fira Code Retina" w:cs="Fira Code Retina"/>
+          <w:sz w:val="20"/>
+          <w:szCs w:val="20"/>
+        </w:rPr>
+        <w:t>nouveau.conf</w:t>
+      </w:r>
+      <w:proofErr w:type="spellEnd"/>
+      <w:r>
+        <w:rPr>
+          <w:rFonts w:ascii="Fira Code Retina" w:hAnsi="Fira Code Retina" w:cs="Fira Code Retina"/>
+          <w:sz w:val="20"/>
+          <w:szCs w:val="20"/>
+        </w:rPr>
+        <w:t>"</w:t>
+      </w:r>
+    </w:p>
+    <w:p>
+      <w:pPr>
+        <w:rPr>
+          <w:rFonts w:ascii="Fira Code Retina" w:hAnsi="Fira Code Retina" w:cs="Fira Code Retina"/>
+          <w:sz w:val="20"/>
+          <w:szCs w:val="20"/>
+        </w:rPr>
+      </w:pPr>
+      <w:proofErr w:type="spellStart"/>
+      <w:r>
+        <w:rPr>
+          <w:rFonts w:ascii="Fira Code Retina" w:hAnsi="Fira Code Retina" w:cs="Fira Code Retina"/>
+          <w:sz w:val="20"/>
+          <w:szCs w:val="20"/>
+        </w:rPr>
+        <w:t>sudo</w:t>
+      </w:r>
+      <w:proofErr w:type="spellEnd"/>
+      <w:r>
+        <w:rPr>
+          <w:rFonts w:ascii="Fira Code Retina" w:hAnsi="Fira Code Retina" w:cs="Fira Code Retina"/>
+          <w:sz w:val="20"/>
+          <w:szCs w:val="20"/>
+        </w:rPr>
+        <w:t xml:space="preserve"> bash -c "echo options nouveau </w:t>
+      </w:r>
+      <w:proofErr w:type="spellStart"/>
+      <w:r>
+        <w:rPr>
+          <w:rFonts w:ascii="Fira Code Retina" w:hAnsi="Fira Code Retina" w:cs="Fira Code Retina"/>
+          <w:sz w:val="20"/>
+          <w:szCs w:val="20"/>
+        </w:rPr>
+        <w:t>modeset</w:t>
+      </w:r>
+      <w:proofErr w:type="spellEnd"/>
+      <w:r>
+        <w:rPr>
+          <w:rFonts w:ascii="Fira Code Retina" w:hAnsi="Fira Code Retina" w:cs="Fira Code Retina"/>
+          <w:sz w:val="20"/>
+          <w:szCs w:val="20"/>
+        </w:rPr>
+        <w:t>=0 &gt;&gt;</w:t>
       </w:r>
       <w:r>
         <w:rPr>
@@ -430,7 +901,61 @@
           <w:sz w:val="20"/>
           <w:szCs w:val="20"/>
         </w:rPr>
-        <w:t>/etc/modprobe.d/blacklist-nvidia-nouveau.conf"</w:t>
+        <w:t>/etc/</w:t>
+      </w:r>
+      <w:proofErr w:type="spellStart"/>
+      <w:r>
+        <w:rPr>
+          <w:rFonts w:ascii="Fira Code Retina" w:hAnsi="Fira Code Retina" w:cs="Fira Code Retina"/>
+          <w:sz w:val="20"/>
+          <w:szCs w:val="20"/>
+        </w:rPr>
+        <w:t>modprobe.d</w:t>
+      </w:r>
+      <w:proofErr w:type="spellEnd"/>
+      <w:r>
+        <w:rPr>
+          <w:rFonts w:ascii="Fira Code Retina" w:hAnsi="Fira Code Retina" w:cs="Fira Code Retina"/>
+          <w:sz w:val="20"/>
+          <w:szCs w:val="20"/>
+        </w:rPr>
+        <w:t>/blacklist-</w:t>
+      </w:r>
+      <w:proofErr w:type="spellStart"/>
+      <w:r>
+        <w:rPr>
+          <w:rFonts w:ascii="Fira Code Retina" w:hAnsi="Fira Code Retina" w:cs="Fira Code Retina"/>
+          <w:sz w:val="20"/>
+          <w:szCs w:val="20"/>
+        </w:rPr>
+        <w:t>nvidia</w:t>
+      </w:r>
+      <w:proofErr w:type="spellEnd"/>
+      <w:r>
+        <w:rPr>
+          <w:rFonts w:ascii="Fira Code Retina" w:hAnsi="Fira Code Retina" w:cs="Fira Code Retina"/>
+          <w:sz w:val="20"/>
+          <w:szCs w:val="20"/>
+        </w:rPr>
+        <w:t>-</w:t>
+      </w:r>
+      <w:proofErr w:type="spellStart"/>
+      <w:r>
+        <w:rPr>
+          <w:rFonts w:ascii="Fira Code Retina" w:hAnsi="Fira Code Retina" w:cs="Fira Code Retina"/>
+          <w:sz w:val="20"/>
+          <w:szCs w:val="20"/>
+        </w:rPr>
+        <w:t>nouveau.conf</w:t>
+      </w:r>
+      <w:proofErr w:type="spellEnd"/>
+      <w:r>
+        <w:rPr>
+          <w:rFonts w:ascii="Fira Code Retina" w:hAnsi="Fira Code Retina" w:cs="Fira Code Retina"/>
+          <w:sz w:val="20"/>
+          <w:szCs w:val="20"/>
+        </w:rPr>
+        <w:t>"</w:t>
       </w:r>
     </w:p>
     <w:p>
@@ -449,13 +974,23 @@
           <w:szCs w:val="20"/>
         </w:rPr>
       </w:pPr>
-      <w:r>
-        <w:rPr>
-          <w:rFonts w:ascii="Fira Code Retina" w:hAnsi="Fira Code Retina" w:cs="Fira Code Retina"/>
-          <w:sz w:val="20"/>
-          <w:szCs w:val="20"/>
-        </w:rPr>
-        <w:t xml:space="preserve">sudo </w:t>
+      <w:proofErr w:type="spellStart"/>
+      <w:r>
+        <w:rPr>
+          <w:rFonts w:ascii="Fira Code Retina" w:hAnsi="Fira Code Retina" w:cs="Fira Code Retina"/>
+          <w:sz w:val="20"/>
+          <w:szCs w:val="20"/>
+        </w:rPr>
+        <w:t>sudo</w:t>
+      </w:r>
+      <w:proofErr w:type="spellEnd"/>
+      <w:r>
+        <w:rPr>
+          <w:rFonts w:ascii="Fira Code Retina" w:hAnsi="Fira Code Retina" w:cs="Fira Code Retina"/>
+          <w:sz w:val="20"/>
+          <w:szCs w:val="20"/>
+        </w:rPr>
+        <w:t xml:space="preserve"> </w:t>
       </w:r>
       <w:r>
         <w:rPr>
@@ -471,15 +1006,51 @@
           <w:sz w:val="20"/>
           <w:szCs w:val="20"/>
         </w:rPr>
-        <w:t xml:space="preserve"> remove x</w:t>
-      </w:r>
-      <w:r>
-        <w:rPr>
-          <w:rFonts w:ascii="Fira Code Retina" w:hAnsi="Fira Code Retina" w:cs="Fira Code Retina"/>
-          <w:sz w:val="20"/>
-          <w:szCs w:val="20"/>
-        </w:rPr>
-        <w:t>server-xorg-video-nouveau</w:t>
+        <w:t xml:space="preserve"> remove </w:t>
+      </w:r>
+      <w:proofErr w:type="spellStart"/>
+      <w:r>
+        <w:rPr>
+          <w:rFonts w:ascii="Fira Code Retina" w:hAnsi="Fira Code Retina" w:cs="Fira Code Retina"/>
+          <w:sz w:val="20"/>
+          <w:szCs w:val="20"/>
+        </w:rPr>
+        <w:t>x</w:t>
+      </w:r>
+      <w:r>
+        <w:rPr>
+          <w:rFonts w:ascii="Fira Code Retina" w:hAnsi="Fira Code Retina" w:cs="Fira Code Retina"/>
+          <w:sz w:val="20"/>
+          <w:szCs w:val="20"/>
+        </w:rPr>
+        <w:t>server</w:t>
+      </w:r>
+      <w:proofErr w:type="spellEnd"/>
+      <w:r>
+        <w:rPr>
+          <w:rFonts w:ascii="Fira Code Retina" w:hAnsi="Fira Code Retina" w:cs="Fira Code Retina"/>
+          <w:sz w:val="20"/>
+          <w:szCs w:val="20"/>
+        </w:rPr>
+        <w:t>-</w:t>
+      </w:r>
+      <w:proofErr w:type="spellStart"/>
+      <w:r>
+        <w:rPr>
+          <w:rFonts w:ascii="Fira Code Retina" w:hAnsi="Fira Code Retina" w:cs="Fira Code Retina"/>
+          <w:sz w:val="20"/>
+          <w:szCs w:val="20"/>
+        </w:rPr>
+        <w:t>xorg</w:t>
+      </w:r>
+      <w:proofErr w:type="spellEnd"/>
+      <w:r>
+        <w:rPr>
+          <w:rFonts w:ascii="Fira Code Retina" w:hAnsi="Fira Code Retina" w:cs="Fira Code Retina"/>
+          <w:sz w:val="20"/>
+          <w:szCs w:val="20"/>
+        </w:rPr>
+        <w:t>-video-nouveau</w:t>
       </w:r>
     </w:p>
     <w:p>
@@ -489,6 +1060,7 @@
       <w:r>
         <w:t xml:space="preserve">Regenerate </w:t>
       </w:r>
+      <w:proofErr w:type="spellStart"/>
       <w:r>
         <w:rPr>
           <w:rFonts w:ascii="Fira Code Retina" w:hAnsi="Fira Code Retina" w:cs="Fira Code Retina"/>
@@ -497,6 +1069,7 @@
         </w:rPr>
         <w:t>initramfs</w:t>
       </w:r>
+      <w:proofErr w:type="spellEnd"/>
       <w:r>
         <w:t>:</w:t>
       </w:r>
@@ -510,6 +1083,7 @@
           <w:szCs w:val="20"/>
         </w:rPr>
       </w:pPr>
+      <w:proofErr w:type="spellStart"/>
       <w:r>
         <w:rPr>
           <w:rFonts w:ascii="Fira Code Retina" w:hAnsi="Fira Code Retina" w:cs="Fira Code Retina"/>
@@ -517,7 +1091,34 @@
           <w:szCs w:val="20"/>
         </w:rPr>
         <w:lastRenderedPageBreak/>
-        <w:t>sudo update-initramfs -u -k all</w:t>
+        <w:t>sudo</w:t>
+      </w:r>
+      <w:proofErr w:type="spellEnd"/>
+      <w:r>
+        <w:rPr>
+          <w:rFonts w:ascii="Fira Code Retina" w:hAnsi="Fira Code Retina" w:cs="Fira Code Retina"/>
+          <w:sz w:val="20"/>
+          <w:szCs w:val="20"/>
+        </w:rPr>
+        <w:t xml:space="preserve"> update-</w:t>
+      </w:r>
+      <w:proofErr w:type="spellStart"/>
+      <w:r>
+        <w:rPr>
+          <w:rFonts w:ascii="Fira Code Retina" w:hAnsi="Fira Code Retina" w:cs="Fira Code Retina"/>
+          <w:sz w:val="20"/>
+          <w:szCs w:val="20"/>
+        </w:rPr>
+        <w:t>initramfs</w:t>
+      </w:r>
+      <w:proofErr w:type="spellEnd"/>
+      <w:r>
+        <w:rPr>
+          <w:rFonts w:ascii="Fira Code Retina" w:hAnsi="Fira Code Retina" w:cs="Fira Code Retina"/>
+          <w:sz w:val="20"/>
+          <w:szCs w:val="20"/>
+        </w:rPr>
+        <w:t xml:space="preserve"> -u -k all</w:t>
       </w:r>
     </w:p>
     <w:p>
@@ -554,7 +1155,61 @@
           <w:sz w:val="20"/>
           <w:szCs w:val="20"/>
         </w:rPr>
-        <w:t>apt download d-itg libsctp1 frr frr-pythontools libcares2 libyang2t64</w:t>
+        <w:t>apt download d-</w:t>
+      </w:r>
+      <w:proofErr w:type="spellStart"/>
+      <w:r>
+        <w:rPr>
+          <w:rFonts w:ascii="Fira Code Retina" w:hAnsi="Fira Code Retina" w:cs="Fira Code Retina"/>
+          <w:sz w:val="20"/>
+          <w:szCs w:val="20"/>
+        </w:rPr>
+        <w:t>itg</w:t>
+      </w:r>
+      <w:proofErr w:type="spellEnd"/>
+      <w:r>
+        <w:rPr>
+          <w:rFonts w:ascii="Fira Code Retina" w:hAnsi="Fira Code Retina" w:cs="Fira Code Retina"/>
+          <w:sz w:val="20"/>
+          <w:szCs w:val="20"/>
+        </w:rPr>
+        <w:t xml:space="preserve"> libsctp1 </w:t>
+      </w:r>
+      <w:proofErr w:type="spellStart"/>
+      <w:r>
+        <w:rPr>
+          <w:rFonts w:ascii="Fira Code Retina" w:hAnsi="Fira Code Retina" w:cs="Fira Code Retina"/>
+          <w:sz w:val="20"/>
+          <w:szCs w:val="20"/>
+        </w:rPr>
+        <w:t>frr</w:t>
+      </w:r>
+      <w:proofErr w:type="spellEnd"/>
+      <w:r>
+        <w:rPr>
+          <w:rFonts w:ascii="Fira Code Retina" w:hAnsi="Fira Code Retina" w:cs="Fira Code Retina"/>
+          <w:sz w:val="20"/>
+          <w:szCs w:val="20"/>
+        </w:rPr>
+        <w:t xml:space="preserve"> </w:t>
+      </w:r>
+      <w:proofErr w:type="spellStart"/>
+      <w:r>
+        <w:rPr>
+          <w:rFonts w:ascii="Fira Code Retina" w:hAnsi="Fira Code Retina" w:cs="Fira Code Retina"/>
+          <w:sz w:val="20"/>
+          <w:szCs w:val="20"/>
+        </w:rPr>
+        <w:t>frr-pythontools</w:t>
+      </w:r>
+      <w:proofErr w:type="spellEnd"/>
+      <w:r>
+        <w:rPr>
+          <w:rFonts w:ascii="Fira Code Retina" w:hAnsi="Fira Code Retina" w:cs="Fira Code Retina"/>
+          <w:sz w:val="20"/>
+          <w:szCs w:val="20"/>
+        </w:rPr>
+        <w:t xml:space="preserve"> libcares2 libyang2t64</w:t>
       </w:r>
     </w:p>
     <w:p>
@@ -590,14 +1245,34 @@
           <w:szCs w:val="20"/>
         </w:rPr>
       </w:pPr>
-      <w:r>
-        <w:rPr>
-          <w:rFonts w:ascii="Fira Code Retina" w:hAnsi="Fira Code Retina" w:cs="Fira Code Retina"/>
-          <w:sz w:val="20"/>
-          <w:szCs w:val="20"/>
-        </w:rPr>
-        <w:t>sudo mount /dev/sda1 /mnt</w:t>
-      </w:r>
+      <w:proofErr w:type="spellStart"/>
+      <w:r>
+        <w:rPr>
+          <w:rFonts w:ascii="Fira Code Retina" w:hAnsi="Fira Code Retina" w:cs="Fira Code Retina"/>
+          <w:sz w:val="20"/>
+          <w:szCs w:val="20"/>
+        </w:rPr>
+        <w:t>sudo</w:t>
+      </w:r>
+      <w:proofErr w:type="spellEnd"/>
+      <w:r>
+        <w:rPr>
+          <w:rFonts w:ascii="Fira Code Retina" w:hAnsi="Fira Code Retina" w:cs="Fira Code Retina"/>
+          <w:sz w:val="20"/>
+          <w:szCs w:val="20"/>
+        </w:rPr>
+        <w:t xml:space="preserve"> mount /dev/sda1 /</w:t>
+      </w:r>
+      <w:proofErr w:type="spellStart"/>
+      <w:r>
+        <w:rPr>
+          <w:rFonts w:ascii="Fira Code Retina" w:hAnsi="Fira Code Retina" w:cs="Fira Code Retina"/>
+          <w:sz w:val="20"/>
+          <w:szCs w:val="20"/>
+        </w:rPr>
+        <w:t>mnt</w:t>
+      </w:r>
+      <w:proofErr w:type="spellEnd"/>
     </w:p>
     <w:p>
       <w:pPr>
@@ -615,13 +1290,77 @@
           <w:szCs w:val="20"/>
         </w:rPr>
       </w:pPr>
-      <w:r>
-        <w:rPr>
-          <w:rFonts w:ascii="Fira Code Retina" w:hAnsi="Fira Code Retina" w:cs="Fira Code Retina"/>
-          <w:sz w:val="20"/>
-          <w:szCs w:val="20"/>
-        </w:rPr>
-        <w:t>sudo dpkg -i /mnt/packages/client/*.deb</w:t>
+      <w:proofErr w:type="spellStart"/>
+      <w:r>
+        <w:rPr>
+          <w:rFonts w:ascii="Fira Code Retina" w:hAnsi="Fira Code Retina" w:cs="Fira Code Retina"/>
+          <w:sz w:val="20"/>
+          <w:szCs w:val="20"/>
+        </w:rPr>
+        <w:t>sudo</w:t>
+      </w:r>
+      <w:proofErr w:type="spellEnd"/>
+      <w:r>
+        <w:rPr>
+          <w:rFonts w:ascii="Fira Code Retina" w:hAnsi="Fira Code Retina" w:cs="Fira Code Retina"/>
+          <w:sz w:val="20"/>
+          <w:szCs w:val="20"/>
+        </w:rPr>
+        <w:t xml:space="preserve"> </w:t>
+      </w:r>
+      <w:proofErr w:type="spellStart"/>
+      <w:r>
+        <w:rPr>
+          <w:rFonts w:ascii="Fira Code Retina" w:hAnsi="Fira Code Retina" w:cs="Fira Code Retina"/>
+          <w:sz w:val="20"/>
+          <w:szCs w:val="20"/>
+        </w:rPr>
+        <w:t>dpkg</w:t>
+      </w:r>
+      <w:proofErr w:type="spellEnd"/>
+      <w:r>
+        <w:rPr>
+          <w:rFonts w:ascii="Fira Code Retina" w:hAnsi="Fira Code Retina" w:cs="Fira Code Retina"/>
+          <w:sz w:val="20"/>
+          <w:szCs w:val="20"/>
+        </w:rPr>
+        <w:t xml:space="preserve"> -</w:t>
+      </w:r>
+      <w:proofErr w:type="spellStart"/>
+      <w:r>
+        <w:rPr>
+          <w:rFonts w:ascii="Fira Code Retina" w:hAnsi="Fira Code Retina" w:cs="Fira Code Retina"/>
+          <w:sz w:val="20"/>
+          <w:szCs w:val="20"/>
+        </w:rPr>
+        <w:t>i</w:t>
+      </w:r>
+      <w:proofErr w:type="spellEnd"/>
+      <w:r>
+        <w:rPr>
+          <w:rFonts w:ascii="Fira Code Retina" w:hAnsi="Fira Code Retina" w:cs="Fira Code Retina"/>
+          <w:sz w:val="20"/>
+          <w:szCs w:val="20"/>
+        </w:rPr>
+        <w:t xml:space="preserve"> /</w:t>
+      </w:r>
+      <w:proofErr w:type="spellStart"/>
+      <w:r>
+        <w:rPr>
+          <w:rFonts w:ascii="Fira Code Retina" w:hAnsi="Fira Code Retina" w:cs="Fira Code Retina"/>
+          <w:sz w:val="20"/>
+          <w:szCs w:val="20"/>
+        </w:rPr>
+        <w:t>mnt</w:t>
+      </w:r>
+      <w:proofErr w:type="spellEnd"/>
+      <w:r>
+        <w:rPr>
+          <w:rFonts w:ascii="Fira Code Retina" w:hAnsi="Fira Code Retina" w:cs="Fira Code Retina"/>
+          <w:sz w:val="20"/>
+          <w:szCs w:val="20"/>
+        </w:rPr>
+        <w:t>/packages/client/*.deb</w:t>
       </w:r>
     </w:p>
     <w:p>
@@ -632,24 +1371,96 @@
         <w:t xml:space="preserve">(Optional) </w:t>
       </w:r>
       <w:r>
-        <w:t>On routers, install frr for dynamic routing:</w:t>
-      </w:r>
-    </w:p>
-    <w:p>
-      <w:pPr>
-        <w:rPr>
-          <w:rFonts w:ascii="Fira Code Retina" w:hAnsi="Fira Code Retina" w:cs="Fira Code Retina"/>
-          <w:sz w:val="20"/>
-          <w:szCs w:val="20"/>
-        </w:rPr>
-      </w:pPr>
-      <w:r>
-        <w:rPr>
-          <w:rFonts w:ascii="Fira Code Retina" w:hAnsi="Fira Code Retina" w:cs="Fira Code Retina"/>
-          <w:sz w:val="20"/>
-          <w:szCs w:val="20"/>
-        </w:rPr>
-        <w:t>sudo dpkg -i /mnt/packages/router/*.deb</w:t>
+        <w:t xml:space="preserve">On routers, install </w:t>
+      </w:r>
+      <w:proofErr w:type="spellStart"/>
+      <w:r>
+        <w:t>frr</w:t>
+      </w:r>
+      <w:proofErr w:type="spellEnd"/>
+      <w:r>
+        <w:t xml:space="preserve"> for dynamic routing:</w:t>
+      </w:r>
+    </w:p>
+    <w:p>
+      <w:pPr>
+        <w:rPr>
+          <w:rFonts w:ascii="Fira Code Retina" w:hAnsi="Fira Code Retina" w:cs="Fira Code Retina"/>
+          <w:sz w:val="20"/>
+          <w:szCs w:val="20"/>
+        </w:rPr>
+      </w:pPr>
+      <w:proofErr w:type="spellStart"/>
+      <w:r>
+        <w:rPr>
+          <w:rFonts w:ascii="Fira Code Retina" w:hAnsi="Fira Code Retina" w:cs="Fira Code Retina"/>
+          <w:sz w:val="20"/>
+          <w:szCs w:val="20"/>
+        </w:rPr>
+        <w:t>sudo</w:t>
+      </w:r>
+      <w:proofErr w:type="spellEnd"/>
+      <w:r>
+        <w:rPr>
+          <w:rFonts w:ascii="Fira Code Retina" w:hAnsi="Fira Code Retina" w:cs="Fira Code Retina"/>
+          <w:sz w:val="20"/>
+          <w:szCs w:val="20"/>
+        </w:rPr>
+        <w:t xml:space="preserve"> </w:t>
+      </w:r>
+      <w:proofErr w:type="spellStart"/>
+      <w:r>
+        <w:rPr>
+          <w:rFonts w:ascii="Fira Code Retina" w:hAnsi="Fira Code Retina" w:cs="Fira Code Retina"/>
+          <w:sz w:val="20"/>
+          <w:szCs w:val="20"/>
+        </w:rPr>
+        <w:t>dpkg</w:t>
+      </w:r>
+      <w:proofErr w:type="spellEnd"/>
+      <w:r>
+        <w:rPr>
+          <w:rFonts w:ascii="Fira Code Retina" w:hAnsi="Fira Code Retina" w:cs="Fira Code Retina"/>
+          <w:sz w:val="20"/>
+          <w:szCs w:val="20"/>
+        </w:rPr>
+        <w:t xml:space="preserve"> -</w:t>
+      </w:r>
+      <w:proofErr w:type="spellStart"/>
+      <w:r>
+        <w:rPr>
+          <w:rFonts w:ascii="Fira Code Retina" w:hAnsi="Fira Code Retina" w:cs="Fira Code Retina"/>
+          <w:sz w:val="20"/>
+          <w:szCs w:val="20"/>
+        </w:rPr>
+        <w:t>i</w:t>
+      </w:r>
+      <w:proofErr w:type="spellEnd"/>
+      <w:r>
+        <w:rPr>
+          <w:rFonts w:ascii="Fira Code Retina" w:hAnsi="Fira Code Retina" w:cs="Fira Code Retina"/>
+          <w:sz w:val="20"/>
+          <w:szCs w:val="20"/>
+        </w:rPr>
+        <w:t xml:space="preserve"> /</w:t>
+      </w:r>
+      <w:proofErr w:type="spellStart"/>
+      <w:r>
+        <w:rPr>
+          <w:rFonts w:ascii="Fira Code Retina" w:hAnsi="Fira Code Retina" w:cs="Fira Code Retina"/>
+          <w:sz w:val="20"/>
+          <w:szCs w:val="20"/>
+        </w:rPr>
+        <w:t>mnt</w:t>
+      </w:r>
+      <w:proofErr w:type="spellEnd"/>
+      <w:r>
+        <w:rPr>
+          <w:rFonts w:ascii="Fira Code Retina" w:hAnsi="Fira Code Retina" w:cs="Fira Code Retina"/>
+          <w:sz w:val="20"/>
+          <w:szCs w:val="20"/>
+        </w:rPr>
+        <w:t>/packages/router/*.deb</w:t>
       </w:r>
     </w:p>
     <w:p>
@@ -677,21 +1488,41 @@
           <w:szCs w:val="20"/>
         </w:rPr>
       </w:pPr>
-      <w:r>
-        <w:rPr>
-          <w:rFonts w:ascii="Fira Code Retina" w:hAnsi="Fira Code Retina" w:cs="Fira Code Retina"/>
-          <w:sz w:val="20"/>
-          <w:szCs w:val="20"/>
-        </w:rPr>
-        <w:t>sudo nano /etc/</w:t>
-      </w:r>
-      <w:r>
-        <w:rPr>
-          <w:rFonts w:ascii="Fira Code Retina" w:hAnsi="Fira Code Retina" w:cs="Fira Code Retina"/>
-          <w:sz w:val="20"/>
-          <w:szCs w:val="20"/>
-        </w:rPr>
-        <w:t>sysctl.d/99-</w:t>
+      <w:proofErr w:type="spellStart"/>
+      <w:r>
+        <w:rPr>
+          <w:rFonts w:ascii="Fira Code Retina" w:hAnsi="Fira Code Retina" w:cs="Fira Code Retina"/>
+          <w:sz w:val="20"/>
+          <w:szCs w:val="20"/>
+        </w:rPr>
+        <w:t>sudo</w:t>
+      </w:r>
+      <w:proofErr w:type="spellEnd"/>
+      <w:r>
+        <w:rPr>
+          <w:rFonts w:ascii="Fira Code Retina" w:hAnsi="Fira Code Retina" w:cs="Fira Code Retina"/>
+          <w:sz w:val="20"/>
+          <w:szCs w:val="20"/>
+        </w:rPr>
+        <w:t xml:space="preserve"> nano /etc/</w:t>
+      </w:r>
+      <w:proofErr w:type="spellStart"/>
+      <w:r>
+        <w:rPr>
+          <w:rFonts w:ascii="Fira Code Retina" w:hAnsi="Fira Code Retina" w:cs="Fira Code Retina"/>
+          <w:sz w:val="20"/>
+          <w:szCs w:val="20"/>
+        </w:rPr>
+        <w:t>sysctl.d</w:t>
+      </w:r>
+      <w:proofErr w:type="spellEnd"/>
+      <w:r>
+        <w:rPr>
+          <w:rFonts w:ascii="Fira Code Retina" w:hAnsi="Fira Code Retina" w:cs="Fira Code Retina"/>
+          <w:sz w:val="20"/>
+          <w:szCs w:val="20"/>
+        </w:rPr>
+        <w:t>/99-</w:t>
       </w:r>
       <w:r>
         <w:rPr>
@@ -767,13 +1598,41 @@
           <w:szCs w:val="20"/>
         </w:rPr>
       </w:pPr>
-      <w:r>
-        <w:rPr>
-          <w:rFonts w:ascii="Fira Code Retina" w:hAnsi="Fira Code Retina" w:cs="Fira Code Retina"/>
-          <w:sz w:val="20"/>
-          <w:szCs w:val="20"/>
-        </w:rPr>
-        <w:t xml:space="preserve">sudo systemctl </w:t>
+      <w:proofErr w:type="spellStart"/>
+      <w:r>
+        <w:rPr>
+          <w:rFonts w:ascii="Fira Code Retina" w:hAnsi="Fira Code Retina" w:cs="Fira Code Retina"/>
+          <w:sz w:val="20"/>
+          <w:szCs w:val="20"/>
+        </w:rPr>
+        <w:t>sudo</w:t>
+      </w:r>
+      <w:proofErr w:type="spellEnd"/>
+      <w:r>
+        <w:rPr>
+          <w:rFonts w:ascii="Fira Code Retina" w:hAnsi="Fira Code Retina" w:cs="Fira Code Retina"/>
+          <w:sz w:val="20"/>
+          <w:szCs w:val="20"/>
+        </w:rPr>
+        <w:t xml:space="preserve"> </w:t>
+      </w:r>
+      <w:proofErr w:type="spellStart"/>
+      <w:r>
+        <w:rPr>
+          <w:rFonts w:ascii="Fira Code Retina" w:hAnsi="Fira Code Retina" w:cs="Fira Code Retina"/>
+          <w:sz w:val="20"/>
+          <w:szCs w:val="20"/>
+        </w:rPr>
+        <w:t>systemctl</w:t>
+      </w:r>
+      <w:proofErr w:type="spellEnd"/>
+      <w:r>
+        <w:rPr>
+          <w:rFonts w:ascii="Fira Code Retina" w:hAnsi="Fira Code Retina" w:cs="Fira Code Retina"/>
+          <w:sz w:val="20"/>
+          <w:szCs w:val="20"/>
+        </w:rPr>
+        <w:t xml:space="preserve"> </w:t>
       </w:r>
       <w:r>
         <w:rPr>
@@ -789,8 +1648,18 @@
           <w:sz w:val="20"/>
           <w:szCs w:val="20"/>
         </w:rPr>
-        <w:t xml:space="preserve"> ufw.service</w:t>
-      </w:r>
+        <w:t xml:space="preserve"> </w:t>
+      </w:r>
+      <w:proofErr w:type="spellStart"/>
+      <w:r>
+        <w:rPr>
+          <w:rFonts w:ascii="Fira Code Retina" w:hAnsi="Fira Code Retina" w:cs="Fira Code Retina"/>
+          <w:sz w:val="20"/>
+          <w:szCs w:val="20"/>
+        </w:rPr>
+        <w:t>ufw.service</w:t>
+      </w:r>
+      <w:proofErr w:type="spellEnd"/>
     </w:p>
     <w:p>
       <w:pPr>
@@ -814,13 +1683,41 @@
           <w:szCs w:val="20"/>
         </w:rPr>
       </w:pPr>
-      <w:r>
-        <w:rPr>
-          <w:rFonts w:ascii="Fira Code Retina" w:hAnsi="Fira Code Retina" w:cs="Fira Code Retina"/>
-          <w:sz w:val="20"/>
-          <w:szCs w:val="20"/>
-        </w:rPr>
-        <w:t>sudo ufw status verbose</w:t>
+      <w:proofErr w:type="spellStart"/>
+      <w:r>
+        <w:rPr>
+          <w:rFonts w:ascii="Fira Code Retina" w:hAnsi="Fira Code Retina" w:cs="Fira Code Retina"/>
+          <w:sz w:val="20"/>
+          <w:szCs w:val="20"/>
+        </w:rPr>
+        <w:t>sudo</w:t>
+      </w:r>
+      <w:proofErr w:type="spellEnd"/>
+      <w:r>
+        <w:rPr>
+          <w:rFonts w:ascii="Fira Code Retina" w:hAnsi="Fira Code Retina" w:cs="Fira Code Retina"/>
+          <w:sz w:val="20"/>
+          <w:szCs w:val="20"/>
+        </w:rPr>
+        <w:t xml:space="preserve"> </w:t>
+      </w:r>
+      <w:proofErr w:type="spellStart"/>
+      <w:r>
+        <w:rPr>
+          <w:rFonts w:ascii="Fira Code Retina" w:hAnsi="Fira Code Retina" w:cs="Fira Code Retina"/>
+          <w:sz w:val="20"/>
+          <w:szCs w:val="20"/>
+        </w:rPr>
+        <w:t>ufw</w:t>
+      </w:r>
+      <w:proofErr w:type="spellEnd"/>
+      <w:r>
+        <w:rPr>
+          <w:rFonts w:ascii="Fira Code Retina" w:hAnsi="Fira Code Retina" w:cs="Fira Code Retina"/>
+          <w:sz w:val="20"/>
+          <w:szCs w:val="20"/>
+        </w:rPr>
+        <w:t xml:space="preserve"> status verbose</w:t>
       </w:r>
     </w:p>
     <w:p>
@@ -831,24 +1728,60 @@
         <w:t>Next,</w:t>
       </w:r>
       <w:r>
-        <w:t xml:space="preserve"> set up netplan with static addresses:</w:t>
-      </w:r>
-    </w:p>
-    <w:p>
-      <w:pPr>
-        <w:rPr>
-          <w:rFonts w:ascii="Fira Code Retina" w:hAnsi="Fira Code Retina" w:cs="Fira Code Retina"/>
-          <w:sz w:val="20"/>
-          <w:szCs w:val="20"/>
-        </w:rPr>
-      </w:pPr>
-      <w:r>
-        <w:rPr>
-          <w:rFonts w:ascii="Fira Code Retina" w:hAnsi="Fira Code Retina" w:cs="Fira Code Retina"/>
-          <w:sz w:val="20"/>
-          <w:szCs w:val="20"/>
-        </w:rPr>
-        <w:t>sudo nano /etc/netplan/50-cloud-init.yaml</w:t>
+        <w:t xml:space="preserve"> set up </w:t>
+      </w:r>
+      <w:proofErr w:type="spellStart"/>
+      <w:r>
+        <w:t>netplan</w:t>
+      </w:r>
+      <w:proofErr w:type="spellEnd"/>
+      <w:r>
+        <w:t xml:space="preserve"> with static addresses:</w:t>
+      </w:r>
+    </w:p>
+    <w:p>
+      <w:pPr>
+        <w:rPr>
+          <w:rFonts w:ascii="Fira Code Retina" w:hAnsi="Fira Code Retina" w:cs="Fira Code Retina"/>
+          <w:sz w:val="20"/>
+          <w:szCs w:val="20"/>
+        </w:rPr>
+      </w:pPr>
+      <w:proofErr w:type="spellStart"/>
+      <w:r>
+        <w:rPr>
+          <w:rFonts w:ascii="Fira Code Retina" w:hAnsi="Fira Code Retina" w:cs="Fira Code Retina"/>
+          <w:sz w:val="20"/>
+          <w:szCs w:val="20"/>
+        </w:rPr>
+        <w:t>sudo</w:t>
+      </w:r>
+      <w:proofErr w:type="spellEnd"/>
+      <w:r>
+        <w:rPr>
+          <w:rFonts w:ascii="Fira Code Retina" w:hAnsi="Fira Code Retina" w:cs="Fira Code Retina"/>
+          <w:sz w:val="20"/>
+          <w:szCs w:val="20"/>
+        </w:rPr>
+        <w:t xml:space="preserve"> nano /etc/</w:t>
+      </w:r>
+      <w:proofErr w:type="spellStart"/>
+      <w:r>
+        <w:rPr>
+          <w:rFonts w:ascii="Fira Code Retina" w:hAnsi="Fira Code Retina" w:cs="Fira Code Retina"/>
+          <w:sz w:val="20"/>
+          <w:szCs w:val="20"/>
+        </w:rPr>
+        <w:t>netplan</w:t>
+      </w:r>
+      <w:proofErr w:type="spellEnd"/>
+      <w:r>
+        <w:rPr>
+          <w:rFonts w:ascii="Fira Code Retina" w:hAnsi="Fira Code Retina" w:cs="Fira Code Retina"/>
+          <w:sz w:val="20"/>
+          <w:szCs w:val="20"/>
+        </w:rPr>
+        <w:t>/50-cloud-init.yaml</w:t>
       </w:r>
     </w:p>
     <w:p>
@@ -3211,6 +4144,7 @@
       <w:r>
         <w:t xml:space="preserve">Configure </w:t>
       </w:r>
+      <w:proofErr w:type="spellStart"/>
       <w:r>
         <w:rPr>
           <w:rFonts w:ascii="Fira Code Retina" w:hAnsi="Fira Code Retina" w:cs="Fira Code Retina"/>
@@ -3219,6 +4153,7 @@
         </w:rPr>
         <w:t>chrony</w:t>
       </w:r>
+      <w:proofErr w:type="spellEnd"/>
       <w:r>
         <w:t>:</w:t>
       </w:r>
@@ -3232,14 +4167,34 @@
           <w:szCs w:val="20"/>
         </w:rPr>
       </w:pPr>
-      <w:r>
-        <w:rPr>
-          <w:rFonts w:ascii="Fira Code Retina" w:hAnsi="Fira Code Retina" w:cs="Fira Code Retina"/>
-          <w:sz w:val="20"/>
-          <w:szCs w:val="20"/>
-        </w:rPr>
-        <w:t>sudo nano /etc/chrony.conf</w:t>
-      </w:r>
+      <w:proofErr w:type="spellStart"/>
+      <w:r>
+        <w:rPr>
+          <w:rFonts w:ascii="Fira Code Retina" w:hAnsi="Fira Code Retina" w:cs="Fira Code Retina"/>
+          <w:sz w:val="20"/>
+          <w:szCs w:val="20"/>
+        </w:rPr>
+        <w:t>sudo</w:t>
+      </w:r>
+      <w:proofErr w:type="spellEnd"/>
+      <w:r>
+        <w:rPr>
+          <w:rFonts w:ascii="Fira Code Retina" w:hAnsi="Fira Code Retina" w:cs="Fira Code Retina"/>
+          <w:sz w:val="20"/>
+          <w:szCs w:val="20"/>
+        </w:rPr>
+        <w:t xml:space="preserve"> nano /etc/</w:t>
+      </w:r>
+      <w:proofErr w:type="spellStart"/>
+      <w:r>
+        <w:rPr>
+          <w:rFonts w:ascii="Fira Code Retina" w:hAnsi="Fira Code Retina" w:cs="Fira Code Retina"/>
+          <w:sz w:val="20"/>
+          <w:szCs w:val="20"/>
+        </w:rPr>
+        <w:t>chrony.conf</w:t>
+      </w:r>
+      <w:proofErr w:type="spellEnd"/>
     </w:p>
     <w:p>
       <w:pPr>
@@ -3270,8 +4225,18 @@
           <w:sz w:val="20"/>
           <w:szCs w:val="20"/>
         </w:rPr>
-        <w:t>.pool.ntp.org iburst</w:t>
-      </w:r>
+        <w:t xml:space="preserve">.pool.ntp.org </w:t>
+      </w:r>
+      <w:proofErr w:type="spellStart"/>
+      <w:r>
+        <w:rPr>
+          <w:rFonts w:ascii="Fira Code Retina" w:hAnsi="Fira Code Retina" w:cs="Fira Code Retina"/>
+          <w:sz w:val="20"/>
+          <w:szCs w:val="20"/>
+        </w:rPr>
+        <w:t>iburst</w:t>
+      </w:r>
+      <w:proofErr w:type="spellEnd"/>
     </w:p>
     <w:p>
       <w:pPr>
@@ -3387,8 +4352,18 @@
           <w:sz w:val="20"/>
           <w:szCs w:val="20"/>
         </w:rPr>
-        <w:t>server 192.168.10.1 iburst</w:t>
-      </w:r>
+        <w:t xml:space="preserve">server 192.168.10.1 </w:t>
+      </w:r>
+      <w:proofErr w:type="spellStart"/>
+      <w:r>
+        <w:rPr>
+          <w:rFonts w:ascii="Fira Code Retina" w:hAnsi="Fira Code Retina" w:cs="Fira Code Retina"/>
+          <w:sz w:val="20"/>
+          <w:szCs w:val="20"/>
+        </w:rPr>
+        <w:t>iburst</w:t>
+      </w:r>
+      <w:proofErr w:type="spellEnd"/>
     </w:p>
     <w:p>
       <w:pPr>
@@ -3410,6 +4385,7 @@
       <w:r>
         <w:t xml:space="preserve">Check </w:t>
       </w:r>
+      <w:proofErr w:type="spellStart"/>
       <w:r>
         <w:rPr>
           <w:rFonts w:ascii="Fira Code Retina" w:hAnsi="Fira Code Retina" w:cs="Fira Code Retina"/>
@@ -3418,6 +4394,7 @@
         </w:rPr>
         <w:t>chrony</w:t>
       </w:r>
+      <w:proofErr w:type="spellEnd"/>
       <w:r>
         <w:t xml:space="preserve"> is configured: </w:t>
       </w:r>
@@ -3431,32 +4408,62 @@
           <w:szCs w:val="20"/>
         </w:rPr>
       </w:pPr>
-      <w:r>
-        <w:rPr>
-          <w:rFonts w:ascii="Fira Code Retina" w:hAnsi="Fira Code Retina" w:cs="Fira Code Retina"/>
-          <w:sz w:val="20"/>
-          <w:szCs w:val="20"/>
-        </w:rPr>
-        <w:t>chronyc tracking</w:t>
-      </w:r>
-    </w:p>
-    <w:p>
-      <w:pPr>
-        <w:spacing w:after="0"/>
-        <w:rPr>
-          <w:rFonts w:ascii="Fira Code Retina" w:hAnsi="Fira Code Retina" w:cs="Fira Code Retina"/>
-          <w:sz w:val="20"/>
-          <w:szCs w:val="20"/>
-        </w:rPr>
-      </w:pPr>
-      <w:r>
-        <w:rPr>
-          <w:rFonts w:ascii="Fira Code Retina" w:hAnsi="Fira Code Retina" w:cs="Fira Code Retina"/>
-          <w:sz w:val="20"/>
-          <w:szCs w:val="20"/>
-        </w:rPr>
-        <w:t>chronyc sources -av</w:t>
-      </w:r>
+      <w:proofErr w:type="spellStart"/>
+      <w:r>
+        <w:rPr>
+          <w:rFonts w:ascii="Fira Code Retina" w:hAnsi="Fira Code Retina" w:cs="Fira Code Retina"/>
+          <w:sz w:val="20"/>
+          <w:szCs w:val="20"/>
+        </w:rPr>
+        <w:t>chronyc</w:t>
+      </w:r>
+      <w:proofErr w:type="spellEnd"/>
+      <w:r>
+        <w:rPr>
+          <w:rFonts w:ascii="Fira Code Retina" w:hAnsi="Fira Code Retina" w:cs="Fira Code Retina"/>
+          <w:sz w:val="20"/>
+          <w:szCs w:val="20"/>
+        </w:rPr>
+        <w:t xml:space="preserve"> tracking</w:t>
+      </w:r>
+    </w:p>
+    <w:p>
+      <w:pPr>
+        <w:spacing w:after="0"/>
+        <w:rPr>
+          <w:rFonts w:ascii="Fira Code Retina" w:hAnsi="Fira Code Retina" w:cs="Fira Code Retina"/>
+          <w:sz w:val="20"/>
+          <w:szCs w:val="20"/>
+        </w:rPr>
+      </w:pPr>
+      <w:proofErr w:type="spellStart"/>
+      <w:r>
+        <w:rPr>
+          <w:rFonts w:ascii="Fira Code Retina" w:hAnsi="Fira Code Retina" w:cs="Fira Code Retina"/>
+          <w:sz w:val="20"/>
+          <w:szCs w:val="20"/>
+        </w:rPr>
+        <w:t>chronyc</w:t>
+      </w:r>
+      <w:proofErr w:type="spellEnd"/>
+      <w:r>
+        <w:rPr>
+          <w:rFonts w:ascii="Fira Code Retina" w:hAnsi="Fira Code Retina" w:cs="Fira Code Retina"/>
+          <w:sz w:val="20"/>
+          <w:szCs w:val="20"/>
+        </w:rPr>
+        <w:t xml:space="preserve"> sources -</w:t>
+      </w:r>
+      <w:proofErr w:type="spellStart"/>
+      <w:r>
+        <w:rPr>
+          <w:rFonts w:ascii="Fira Code Retina" w:hAnsi="Fira Code Retina" w:cs="Fira Code Retina"/>
+          <w:sz w:val="20"/>
+          <w:szCs w:val="20"/>
+        </w:rPr>
+        <w:t>av</w:t>
+      </w:r>
+      <w:proofErr w:type="spellEnd"/>
     </w:p>
     <w:p>
       <w:pPr>
@@ -3620,7 +4627,31 @@
     </w:p>
     <w:p>
       <w:r>
-        <w:t>The default meter is owdm (one-way delay meter), which only produces correct data if all PCs have clocks in sync (e.g. via timesyncd or chrony).</w:t>
+        <w:t xml:space="preserve">The default meter is </w:t>
+      </w:r>
+      <w:proofErr w:type="spellStart"/>
+      <w:r>
+        <w:t>owdm</w:t>
+      </w:r>
+      <w:proofErr w:type="spellEnd"/>
+      <w:r>
+        <w:t xml:space="preserve"> (one-way delay meter), which only produces correct data if all PCs have clocks in sync (e.g. via </w:t>
+      </w:r>
+      <w:proofErr w:type="spellStart"/>
+      <w:r>
+        <w:t>timesyncd</w:t>
+      </w:r>
+      <w:proofErr w:type="spellEnd"/>
+      <w:r>
+        <w:t xml:space="preserve"> or </w:t>
+      </w:r>
+      <w:proofErr w:type="spellStart"/>
+      <w:r>
+        <w:t>chrony</w:t>
+      </w:r>
+      <w:proofErr w:type="spellEnd"/>
+      <w:r>
+        <w:t>).</w:t>
       </w:r>
     </w:p>
     <w:p>
@@ -3639,6 +4670,7 @@
           <w:szCs w:val="20"/>
         </w:rPr>
       </w:pPr>
+      <w:proofErr w:type="spellStart"/>
       <w:r>
         <w:rPr>
           <w:rFonts w:ascii="Fira Code Retina" w:hAnsi="Fira Code Retina" w:cs="Fira Code Retina"/>
@@ -3647,6 +4679,7 @@
         </w:rPr>
         <w:t>ITGRecv</w:t>
       </w:r>
+      <w:proofErr w:type="spellEnd"/>
     </w:p>
     <w:p>
       <w:pPr>
@@ -3672,13 +4705,59 @@
           <w:szCs w:val="20"/>
         </w:rPr>
       </w:pPr>
-      <w:r>
-        <w:rPr>
-          <w:rFonts w:ascii="Fira Code Retina" w:hAnsi="Fira Code Retina" w:cs="Fira Code Retina"/>
-          <w:sz w:val="20"/>
-          <w:szCs w:val="20"/>
-        </w:rPr>
-        <w:t>ITGSend -a 192.168.30.2 -T &lt;protocol&gt; -c &lt;pkt_size&gt; -t 30000 -m rttm -l send.log -x recv.log</w:t>
+      <w:proofErr w:type="spellStart"/>
+      <w:r>
+        <w:rPr>
+          <w:rFonts w:ascii="Fira Code Retina" w:hAnsi="Fira Code Retina" w:cs="Fira Code Retina"/>
+          <w:sz w:val="20"/>
+          <w:szCs w:val="20"/>
+        </w:rPr>
+        <w:t>ITGSend</w:t>
+      </w:r>
+      <w:proofErr w:type="spellEnd"/>
+      <w:r>
+        <w:rPr>
+          <w:rFonts w:ascii="Fira Code Retina" w:hAnsi="Fira Code Retina" w:cs="Fira Code Retina"/>
+          <w:sz w:val="20"/>
+          <w:szCs w:val="20"/>
+        </w:rPr>
+        <w:t xml:space="preserve"> -a 192.168.30.2 -T &lt;protocol&gt; -c &lt;</w:t>
+      </w:r>
+      <w:proofErr w:type="spellStart"/>
+      <w:r>
+        <w:rPr>
+          <w:rFonts w:ascii="Fira Code Retina" w:hAnsi="Fira Code Retina" w:cs="Fira Code Retina"/>
+          <w:sz w:val="20"/>
+          <w:szCs w:val="20"/>
+        </w:rPr>
+        <w:t>pkt_size</w:t>
+      </w:r>
+      <w:proofErr w:type="spellEnd"/>
+      <w:r>
+        <w:rPr>
+          <w:rFonts w:ascii="Fira Code Retina" w:hAnsi="Fira Code Retina" w:cs="Fira Code Retina"/>
+          <w:sz w:val="20"/>
+          <w:szCs w:val="20"/>
+        </w:rPr>
+        <w:t xml:space="preserve">&gt; -t 30000 -m </w:t>
+      </w:r>
+      <w:proofErr w:type="spellStart"/>
+      <w:r>
+        <w:rPr>
+          <w:rFonts w:ascii="Fira Code Retina" w:hAnsi="Fira Code Retina" w:cs="Fira Code Retina"/>
+          <w:sz w:val="20"/>
+          <w:szCs w:val="20"/>
+        </w:rPr>
+        <w:t>rttm</w:t>
+      </w:r>
+      <w:proofErr w:type="spellEnd"/>
+      <w:r>
+        <w:rPr>
+          <w:rFonts w:ascii="Fira Code Retina" w:hAnsi="Fira Code Retina" w:cs="Fira Code Retina"/>
+          <w:sz w:val="20"/>
+          <w:szCs w:val="20"/>
+        </w:rPr>
+        <w:t xml:space="preserve"> -l send.log -x recv.log</w:t>
       </w:r>
     </w:p>
     <w:p>
@@ -3697,13 +4776,59 @@
           <w:szCs w:val="20"/>
         </w:rPr>
       </w:pPr>
-      <w:r>
-        <w:rPr>
-          <w:rFonts w:ascii="Fira Code Retina" w:hAnsi="Fira Code Retina" w:cs="Fira Code Retina"/>
-          <w:sz w:val="20"/>
-          <w:szCs w:val="20"/>
-        </w:rPr>
-        <w:t>ITGSend -a fd00:0:0:30::2 -T &lt;protocol&gt; -c &lt;pkt_size&gt; -t 30000 -m rttm -l send.log -x recv.log</w:t>
+      <w:proofErr w:type="spellStart"/>
+      <w:r>
+        <w:rPr>
+          <w:rFonts w:ascii="Fira Code Retina" w:hAnsi="Fira Code Retina" w:cs="Fira Code Retina"/>
+          <w:sz w:val="20"/>
+          <w:szCs w:val="20"/>
+        </w:rPr>
+        <w:t>ITGSend</w:t>
+      </w:r>
+      <w:proofErr w:type="spellEnd"/>
+      <w:r>
+        <w:rPr>
+          <w:rFonts w:ascii="Fira Code Retina" w:hAnsi="Fira Code Retina" w:cs="Fira Code Retina"/>
+          <w:sz w:val="20"/>
+          <w:szCs w:val="20"/>
+        </w:rPr>
+        <w:t xml:space="preserve"> -a fd00:0:0:30::2 -T &lt;protocol&gt; -c &lt;</w:t>
+      </w:r>
+      <w:proofErr w:type="spellStart"/>
+      <w:r>
+        <w:rPr>
+          <w:rFonts w:ascii="Fira Code Retina" w:hAnsi="Fira Code Retina" w:cs="Fira Code Retina"/>
+          <w:sz w:val="20"/>
+          <w:szCs w:val="20"/>
+        </w:rPr>
+        <w:t>pkt_size</w:t>
+      </w:r>
+      <w:proofErr w:type="spellEnd"/>
+      <w:r>
+        <w:rPr>
+          <w:rFonts w:ascii="Fira Code Retina" w:hAnsi="Fira Code Retina" w:cs="Fira Code Retina"/>
+          <w:sz w:val="20"/>
+          <w:szCs w:val="20"/>
+        </w:rPr>
+        <w:t xml:space="preserve">&gt; -t 30000 -m </w:t>
+      </w:r>
+      <w:proofErr w:type="spellStart"/>
+      <w:r>
+        <w:rPr>
+          <w:rFonts w:ascii="Fira Code Retina" w:hAnsi="Fira Code Retina" w:cs="Fira Code Retina"/>
+          <w:sz w:val="20"/>
+          <w:szCs w:val="20"/>
+        </w:rPr>
+        <w:t>rttm</w:t>
+      </w:r>
+      <w:proofErr w:type="spellEnd"/>
+      <w:r>
+        <w:rPr>
+          <w:rFonts w:ascii="Fira Code Retina" w:hAnsi="Fira Code Retina" w:cs="Fira Code Retina"/>
+          <w:sz w:val="20"/>
+          <w:szCs w:val="20"/>
+        </w:rPr>
+        <w:t xml:space="preserve"> -l send.log -x recv.log</w:t>
       </w:r>
     </w:p>
     <w:p>
@@ -3725,7 +4850,15 @@
         <w:spacing w:after="0"/>
       </w:pPr>
       <w:r>
-        <w:t>Logs can be decrypted with ITGDec:</w:t>
+        <w:t xml:space="preserve">Logs can be decrypted with </w:t>
+      </w:r>
+      <w:proofErr w:type="spellStart"/>
+      <w:r>
+        <w:t>ITGDec</w:t>
+      </w:r>
+      <w:proofErr w:type="spellEnd"/>
+      <w:r>
+        <w:t>:</w:t>
       </w:r>
     </w:p>
     <w:p>
@@ -3748,13 +4881,23 @@
       <w:r>
         <w:tab/>
       </w:r>
-      <w:r>
-        <w:rPr>
-          <w:rFonts w:ascii="Fira Code Retina" w:hAnsi="Fira Code Retina" w:cs="Fira Code Retina"/>
-          <w:sz w:val="20"/>
-          <w:szCs w:val="20"/>
-        </w:rPr>
-        <w:t>ITGDec &lt;name&gt;.log -l &lt;name&gt;.txt</w:t>
+      <w:proofErr w:type="spellStart"/>
+      <w:r>
+        <w:rPr>
+          <w:rFonts w:ascii="Fira Code Retina" w:hAnsi="Fira Code Retina" w:cs="Fira Code Retina"/>
+          <w:sz w:val="20"/>
+          <w:szCs w:val="20"/>
+        </w:rPr>
+        <w:t>ITGDec</w:t>
+      </w:r>
+      <w:proofErr w:type="spellEnd"/>
+      <w:r>
+        <w:rPr>
+          <w:rFonts w:ascii="Fira Code Retina" w:hAnsi="Fira Code Retina" w:cs="Fira Code Retina"/>
+          <w:sz w:val="20"/>
+          <w:szCs w:val="20"/>
+        </w:rPr>
+        <w:t xml:space="preserve"> &lt;name&gt;.log -l &lt;name&gt;.txt</w:t>
       </w:r>
     </w:p>
     <w:p>
@@ -3763,7 +4906,15 @@
       </w:pPr>
       <w:r>
         <w:tab/>
-        <w:t>To DATs (for use with Octave or MatPlot):</w:t>
+        <w:t xml:space="preserve">To DATs (for use with Octave or </w:t>
+      </w:r>
+      <w:proofErr w:type="spellStart"/>
+      <w:r>
+        <w:t>MatPlot</w:t>
+      </w:r>
+      <w:proofErr w:type="spellEnd"/>
+      <w:r>
+        <w:t>):</w:t>
       </w:r>
     </w:p>
     <w:p>
@@ -3786,14 +4937,34 @@
       <w:r>
         <w:tab/>
       </w:r>
-      <w:r>
-        <w:rPr>
-          <w:rFonts w:ascii="Fira Code Retina" w:hAnsi="Fira Code Retina" w:cs="Fira Code Retina"/>
-          <w:sz w:val="20"/>
-          <w:szCs w:val="20"/>
-        </w:rPr>
-        <w:t>ITGDec &lt;name&gt;.log -o &lt;name&gt;.dat</w:t>
-      </w:r>
+      <w:proofErr w:type="spellStart"/>
+      <w:r>
+        <w:rPr>
+          <w:rFonts w:ascii="Fira Code Retina" w:hAnsi="Fira Code Retina" w:cs="Fira Code Retina"/>
+          <w:sz w:val="20"/>
+          <w:szCs w:val="20"/>
+        </w:rPr>
+        <w:t>ITGDec</w:t>
+      </w:r>
+      <w:proofErr w:type="spellEnd"/>
+      <w:r>
+        <w:rPr>
+          <w:rFonts w:ascii="Fira Code Retina" w:hAnsi="Fira Code Retina" w:cs="Fira Code Retina"/>
+          <w:sz w:val="20"/>
+          <w:szCs w:val="20"/>
+        </w:rPr>
+        <w:t xml:space="preserve"> &lt;name&gt;.log -o &lt;name&gt;.</w:t>
+      </w:r>
+      <w:proofErr w:type="spellStart"/>
+      <w:r>
+        <w:rPr>
+          <w:rFonts w:ascii="Fira Code Retina" w:hAnsi="Fira Code Retina" w:cs="Fira Code Retina"/>
+          <w:sz w:val="20"/>
+          <w:szCs w:val="20"/>
+        </w:rPr>
+        <w:t>dat</w:t>
+      </w:r>
+      <w:proofErr w:type="spellEnd"/>
     </w:p>
     <w:p>
       <w:pPr>
@@ -3815,13 +4986,23 @@
       <w:r>
         <w:tab/>
       </w:r>
-      <w:r>
-        <w:rPr>
-          <w:rFonts w:ascii="Fira Code Retina" w:hAnsi="Fira Code Retina" w:cs="Fira Code Retina"/>
-          <w:sz w:val="20"/>
-          <w:szCs w:val="20"/>
-        </w:rPr>
-        <w:t>ITGDec &lt;name&gt;.log -d 100 &lt;name&gt;_delay.dat</w:t>
+      <w:proofErr w:type="spellStart"/>
+      <w:r>
+        <w:rPr>
+          <w:rFonts w:ascii="Fira Code Retina" w:hAnsi="Fira Code Retina" w:cs="Fira Code Retina"/>
+          <w:sz w:val="20"/>
+          <w:szCs w:val="20"/>
+        </w:rPr>
+        <w:t>ITGDec</w:t>
+      </w:r>
+      <w:proofErr w:type="spellEnd"/>
+      <w:r>
+        <w:rPr>
+          <w:rFonts w:ascii="Fira Code Retina" w:hAnsi="Fira Code Retina" w:cs="Fira Code Retina"/>
+          <w:sz w:val="20"/>
+          <w:szCs w:val="20"/>
+        </w:rPr>
+        <w:t xml:space="preserve"> &lt;name&gt;.log -d 100 &lt;name&gt;_delay.dat</w:t>
       </w:r>
     </w:p>
     <w:p>
@@ -3844,13 +5025,23 @@
       <w:r>
         <w:tab/>
       </w:r>
-      <w:r>
-        <w:rPr>
-          <w:rFonts w:ascii="Fira Code Retina" w:hAnsi="Fira Code Retina" w:cs="Fira Code Retina"/>
-          <w:sz w:val="20"/>
-          <w:szCs w:val="20"/>
-        </w:rPr>
-        <w:t>ITGDec &lt;name&gt;.log -j 100 &lt;name&gt;_jitter.dat</w:t>
+      <w:proofErr w:type="spellStart"/>
+      <w:r>
+        <w:rPr>
+          <w:rFonts w:ascii="Fira Code Retina" w:hAnsi="Fira Code Retina" w:cs="Fira Code Retina"/>
+          <w:sz w:val="20"/>
+          <w:szCs w:val="20"/>
+        </w:rPr>
+        <w:t>ITGDec</w:t>
+      </w:r>
+      <w:proofErr w:type="spellEnd"/>
+      <w:r>
+        <w:rPr>
+          <w:rFonts w:ascii="Fira Code Retina" w:hAnsi="Fira Code Retina" w:cs="Fira Code Retina"/>
+          <w:sz w:val="20"/>
+          <w:szCs w:val="20"/>
+        </w:rPr>
+        <w:t xml:space="preserve"> &lt;name&gt;.log -j 100 &lt;name&gt;_jitter.dat</w:t>
       </w:r>
     </w:p>
     <w:p>
@@ -3873,13 +5064,23 @@
       <w:r>
         <w:tab/>
       </w:r>
-      <w:r>
-        <w:rPr>
-          <w:rFonts w:ascii="Fira Code Retina" w:hAnsi="Fira Code Retina" w:cs="Fira Code Retina"/>
-          <w:sz w:val="20"/>
-          <w:szCs w:val="20"/>
-        </w:rPr>
-        <w:t>ITGDec &lt;name&gt;.log -p 100 &lt;name&gt;_packetloss.dat</w:t>
+      <w:proofErr w:type="spellStart"/>
+      <w:r>
+        <w:rPr>
+          <w:rFonts w:ascii="Fira Code Retina" w:hAnsi="Fira Code Retina" w:cs="Fira Code Retina"/>
+          <w:sz w:val="20"/>
+          <w:szCs w:val="20"/>
+        </w:rPr>
+        <w:t>ITGDec</w:t>
+      </w:r>
+      <w:proofErr w:type="spellEnd"/>
+      <w:r>
+        <w:rPr>
+          <w:rFonts w:ascii="Fira Code Retina" w:hAnsi="Fira Code Retina" w:cs="Fira Code Retina"/>
+          <w:sz w:val="20"/>
+          <w:szCs w:val="20"/>
+        </w:rPr>
+        <w:t xml:space="preserve"> &lt;name&gt;.log -p 100 &lt;name&gt;_packetloss.dat</w:t>
       </w:r>
     </w:p>
     <w:p>
@@ -3902,13 +5103,23 @@
       <w:r>
         <w:tab/>
       </w:r>
-      <w:r>
-        <w:rPr>
-          <w:rFonts w:ascii="Fira Code Retina" w:hAnsi="Fira Code Retina" w:cs="Fira Code Retina"/>
-          <w:sz w:val="20"/>
-          <w:szCs w:val="20"/>
-        </w:rPr>
-        <w:t>ITGDec &lt;name&gt;.log -b 100 &lt;name&gt;_throughput.dat</w:t>
+      <w:proofErr w:type="spellStart"/>
+      <w:r>
+        <w:rPr>
+          <w:rFonts w:ascii="Fira Code Retina" w:hAnsi="Fira Code Retina" w:cs="Fira Code Retina"/>
+          <w:sz w:val="20"/>
+          <w:szCs w:val="20"/>
+        </w:rPr>
+        <w:t>ITGDec</w:t>
+      </w:r>
+      <w:proofErr w:type="spellEnd"/>
+      <w:r>
+        <w:rPr>
+          <w:rFonts w:ascii="Fira Code Retina" w:hAnsi="Fira Code Retina" w:cs="Fira Code Retina"/>
+          <w:sz w:val="20"/>
+          <w:szCs w:val="20"/>
+        </w:rPr>
+        <w:t xml:space="preserve"> &lt;name&gt;.log -b 100 &lt;name&gt;_throughput.dat</w:t>
       </w:r>
     </w:p>
     <w:sectPr>

</xml_diff>